<commit_message>
Updating the CV to re-remove the abstract of my JMP. Nothing else, really.
</commit_message>
<xml_diff>
--- a/res/JReaves_CV.docx
+++ b/res/JReaves_CV.docx
@@ -498,59 +498,6 @@
           <w:tab w:val="right" w:pos="9360"/>
         </w:tabs>
         <w:spacing w:after="0" w:line="240" w:lineRule="auto"/>
-        <w:ind w:left="360"/>
-        <w:rPr>
-          <w:rFonts w:ascii="Cambria" w:eastAsia="Cambria" w:hAnsi="Cambria" w:cs="Cambria"/>
-          <w:sz w:val="18"/>
-          <w:szCs w:val="18"/>
-        </w:rPr>
-      </w:pPr>
-      <w:r>
-        <w:rPr>
-          <w:rFonts w:ascii="Cambria" w:eastAsia="Cambria" w:hAnsi="Cambria" w:cs="Cambria"/>
-          <w:sz w:val="18"/>
-          <w:szCs w:val="18"/>
-        </w:rPr>
-        <w:t xml:space="preserve">Consumers are increasingly sorting into different consumption “silos,” devoting larger portions of their spending to household-specific products. Previous work suggests that Internet use should hasten this sorting, as advertisers leverage greater data availability to target ads and other interventions, keeping consumers in their silos. In this paper, I explore how smartphone access contributed to changes in consumer sorting. After using random forests to create the first public, national dataset on mobile Internet (3G) rollout, I demonstrate that being able to use smartphones while shopping shifts purchasing towards smaller brands and </w:t>
-      </w:r>
-      <w:proofErr w:type="gramStart"/>
-      <w:r>
-        <w:rPr>
-          <w:rFonts w:ascii="Cambria" w:eastAsia="Cambria" w:hAnsi="Cambria" w:cs="Cambria"/>
-          <w:sz w:val="18"/>
-          <w:szCs w:val="18"/>
-        </w:rPr>
-        <w:t>actually offsets</w:t>
-      </w:r>
-      <w:proofErr w:type="gramEnd"/>
-      <w:r>
-        <w:rPr>
-          <w:rFonts w:ascii="Cambria" w:eastAsia="Cambria" w:hAnsi="Cambria" w:cs="Cambria"/>
-          <w:sz w:val="18"/>
-          <w:szCs w:val="18"/>
-        </w:rPr>
-        <w:t xml:space="preserve"> “siloing” by inducing greater consumer experimentation. I next estimate demand for beer, toilet paper, and other products to better understand market changes from 2007 to 2017. Demand estimation results show that smartphones shrink price elasticities but do not generally affect brand relevance. Better product matches should improve consumer welfare, though firm knowledge of consumer preferences could capture these improvements as profit. I ultimately conclude that the introduction of smartphones leads to a significant increase in consumer welfare.</w:t>
-      </w:r>
-    </w:p>
-    <w:p>
-      <w:pPr>
-        <w:tabs>
-          <w:tab w:val="right" w:pos="9360"/>
-        </w:tabs>
-        <w:spacing w:after="0" w:line="240" w:lineRule="auto"/>
-        <w:rPr>
-          <w:rFonts w:ascii="Cambria" w:eastAsia="Cambria" w:hAnsi="Cambria" w:cs="Cambria"/>
-          <w:sz w:val="18"/>
-          <w:szCs w:val="18"/>
-        </w:rPr>
-      </w:pPr>
-    </w:p>
-    <w:p>
-      <w:pPr>
-        <w:tabs>
-          <w:tab w:val="right" w:pos="9360"/>
-        </w:tabs>
-        <w:spacing w:after="0" w:line="240" w:lineRule="auto"/>
         <w:rPr>
           <w:rFonts w:ascii="Cambria" w:eastAsia="Cambria" w:hAnsi="Cambria" w:cs="Cambria"/>
           <w:b/>
@@ -1097,7 +1044,6 @@
           <w:rFonts w:ascii="Cambria" w:eastAsia="Cambria" w:hAnsi="Cambria" w:cs="Cambria"/>
           <w:u w:val="single"/>
         </w:rPr>
-        <w:lastRenderedPageBreak/>
         <w:t>Reaves, John</w:t>
       </w:r>
       <w:r>
@@ -1285,6 +1231,7 @@
         <w:rPr>
           <w:rFonts w:ascii="Cambria" w:eastAsia="Cambria" w:hAnsi="Cambria" w:cs="Cambria"/>
         </w:rPr>
+        <w:lastRenderedPageBreak/>
         <w:t xml:space="preserve">Flavin, Timothy, Thomas Steiner, </w:t>
       </w:r>
       <w:r>
@@ -1645,21 +1592,7 @@
           <w:rFonts w:ascii="Cambria" w:eastAsia="Cambria" w:hAnsi="Cambria" w:cs="Cambria"/>
           <w:lang w:val="es-AR"/>
         </w:rPr>
-        <w:t xml:space="preserve">TA, EC 450 </w:t>
-      </w:r>
-      <w:r>
-        <w:rPr>
-          <w:rFonts w:ascii="Cambria" w:eastAsia="Cambria" w:hAnsi="Cambria" w:cs="Cambria"/>
-          <w:lang w:val="es-AR"/>
-        </w:rPr>
-        <w:t>—</w:t>
-      </w:r>
-      <w:r>
-        <w:rPr>
-          <w:rFonts w:ascii="Cambria" w:eastAsia="Cambria" w:hAnsi="Cambria" w:cs="Cambria"/>
-          <w:lang w:val="es-AR"/>
-        </w:rPr>
-        <w:t xml:space="preserve"> </w:t>
+        <w:t xml:space="preserve">TA, EC 450 — </w:t>
       </w:r>
       <w:proofErr w:type="spellStart"/>
       <w:r>
@@ -1719,21 +1652,7 @@
           <w:rFonts w:ascii="Cambria" w:eastAsia="Cambria" w:hAnsi="Cambria" w:cs="Cambria"/>
           <w:lang w:val="es-AR"/>
         </w:rPr>
-        <w:t xml:space="preserve">TA, EC 499 </w:t>
-      </w:r>
-      <w:r>
-        <w:rPr>
-          <w:rFonts w:ascii="Cambria" w:eastAsia="Cambria" w:hAnsi="Cambria" w:cs="Cambria"/>
-          <w:lang w:val="es-AR"/>
-        </w:rPr>
-        <w:t>—</w:t>
-      </w:r>
-      <w:r>
-        <w:rPr>
-          <w:rFonts w:ascii="Cambria" w:eastAsia="Cambria" w:hAnsi="Cambria" w:cs="Cambria"/>
-          <w:lang w:val="es-AR"/>
-        </w:rPr>
-        <w:t xml:space="preserve"> Senior </w:t>
+        <w:t xml:space="preserve">TA, EC 499 — Senior </w:t>
       </w:r>
       <w:proofErr w:type="spellStart"/>
       <w:r>
@@ -2011,7 +1930,6 @@
           <w:b/>
           <w:bCs/>
         </w:rPr>
-        <w:lastRenderedPageBreak/>
         <w:t>Research Experience</w:t>
       </w:r>
     </w:p>
@@ -2173,6 +2091,28 @@
           <w:b/>
           <w:bCs/>
         </w:rPr>
+        <w:br/>
+      </w:r>
+    </w:p>
+    <w:p>
+      <w:pPr>
+        <w:tabs>
+          <w:tab w:val="right" w:pos="9360"/>
+        </w:tabs>
+        <w:spacing w:after="0" w:line="240" w:lineRule="auto"/>
+        <w:rPr>
+          <w:rFonts w:ascii="Cambria" w:eastAsia="Cambria" w:hAnsi="Cambria" w:cs="Cambria"/>
+          <w:b/>
+          <w:bCs/>
+        </w:rPr>
+      </w:pPr>
+      <w:r>
+        <w:rPr>
+          <w:rFonts w:ascii="Cambria" w:eastAsia="Cambria" w:hAnsi="Cambria" w:cs="Cambria"/>
+          <w:b/>
+          <w:bCs/>
+        </w:rPr>
+        <w:lastRenderedPageBreak/>
         <w:t>Service</w:t>
       </w:r>
     </w:p>
@@ -2197,13 +2137,7 @@
         <w:rPr>
           <w:rFonts w:ascii="Cambria" w:eastAsia="Cambria" w:hAnsi="Cambria" w:cs="Cambria"/>
         </w:rPr>
-        <w:t xml:space="preserve"> </w:t>
-      </w:r>
-      <w:r>
-        <w:rPr>
-          <w:rFonts w:ascii="Cambria" w:eastAsia="Cambria" w:hAnsi="Cambria" w:cs="Cambria"/>
-        </w:rPr>
-        <w:t>Fellowship | MSU</w:t>
+        <w:t xml:space="preserve"> Fellowship | MSU</w:t>
       </w:r>
       <w:r>
         <w:rPr>
@@ -2492,13 +2426,7 @@
         <w:rPr>
           <w:rFonts w:ascii="Cambria" w:eastAsia="Cambria" w:hAnsi="Cambria" w:cs="Cambria"/>
         </w:rPr>
-        <w:t xml:space="preserve">      </w:t>
-      </w:r>
-      <w:r>
-        <w:rPr>
-          <w:rFonts w:ascii="Cambria" w:eastAsia="Cambria" w:hAnsi="Cambria" w:cs="Cambria"/>
-        </w:rPr>
-        <w:t>R/RStudio, LaTeX, Git/</w:t>
+        <w:t xml:space="preserve">      R/RStudio, LaTeX, Git/</w:t>
       </w:r>
       <w:proofErr w:type="spellStart"/>
       <w:r>

</xml_diff>

<commit_message>
Fixing the title of my JMP.
</commit_message>
<xml_diff>
--- a/res/JReaves_CV.docx
+++ b/res/JReaves_CV.docx
@@ -237,19 +237,11 @@
               </w:rPr>
               <w:br/>
             </w:r>
-            <w:proofErr w:type="spellStart"/>
             <w:r>
               <w:rPr>
                 <w:rFonts w:ascii="Cambria" w:eastAsia="Cambria" w:hAnsi="Cambria" w:cs="Cambria"/>
               </w:rPr>
-              <w:t>ORCiD</w:t>
-            </w:r>
-            <w:proofErr w:type="spellEnd"/>
-            <w:r>
-              <w:rPr>
-                <w:rFonts w:ascii="Cambria" w:eastAsia="Cambria" w:hAnsi="Cambria" w:cs="Cambria"/>
-              </w:rPr>
-              <w:t xml:space="preserve"> ID: </w:t>
+              <w:t xml:space="preserve">ORCiD ID: </w:t>
             </w:r>
             <w:hyperlink r:id="rId7">
               <w:r>
@@ -354,28 +346,14 @@
         <w:rPr>
           <w:rFonts w:ascii="Cambria" w:eastAsia="Cambria" w:hAnsi="Cambria" w:cs="Cambria"/>
         </w:rPr>
-        <w:t xml:space="preserve">Ph.D. | Economics, Michigan State </w:t>
-      </w:r>
-      <w:proofErr w:type="gramStart"/>
-      <w:r>
-        <w:rPr>
-          <w:rFonts w:ascii="Cambria" w:eastAsia="Cambria" w:hAnsi="Cambria" w:cs="Cambria"/>
-        </w:rPr>
-        <w:t xml:space="preserve">University </w:t>
+        <w:t xml:space="preserve">Ph.D. | Economics, Michigan State University </w:t>
       </w:r>
       <w:r>
         <w:rPr>
           <w:rFonts w:ascii="Cambria" w:eastAsia="Cambria" w:hAnsi="Cambria" w:cs="Cambria"/>
         </w:rPr>
         <w:tab/>
-        <w:t>(</w:t>
-      </w:r>
-      <w:proofErr w:type="gramEnd"/>
-      <w:r>
-        <w:rPr>
-          <w:rFonts w:ascii="Cambria" w:eastAsia="Cambria" w:hAnsi="Cambria" w:cs="Cambria"/>
-        </w:rPr>
-        <w:t>exp.) 2027</w:t>
+        <w:t>(exp.) 2027</w:t>
       </w:r>
     </w:p>
     <w:p>
@@ -481,7 +459,7 @@
           <w:i/>
           <w:iCs/>
         </w:rPr>
-        <w:t>“Price Check: Mobile Broadband and Consumer Price Response”</w:t>
+        <w:t>“Mobile Broadband and Consumer Price Response”</w:t>
       </w:r>
       <w:r>
         <w:rPr>
@@ -838,35 +816,7 @@
         <w:rPr>
           <w:rFonts w:ascii="Cambria" w:eastAsia="Cambria" w:hAnsi="Cambria" w:cs="Cambria"/>
         </w:rPr>
-        <w:t xml:space="preserve">, Hope O. </w:t>
-      </w:r>
-      <w:proofErr w:type="spellStart"/>
-      <w:r>
-        <w:rPr>
-          <w:rFonts w:ascii="Cambria" w:eastAsia="Cambria" w:hAnsi="Cambria" w:cs="Cambria"/>
-        </w:rPr>
-        <w:t>Akaeze</w:t>
-      </w:r>
-      <w:proofErr w:type="spellEnd"/>
-      <w:r>
-        <w:rPr>
-          <w:rFonts w:ascii="Cambria" w:eastAsia="Cambria" w:hAnsi="Cambria" w:cs="Cambria"/>
-        </w:rPr>
-        <w:t xml:space="preserve">, Holli A. Schlukebir, Steven R. Miller, Henry O. </w:t>
-      </w:r>
-      <w:proofErr w:type="spellStart"/>
-      <w:r>
-        <w:rPr>
-          <w:rFonts w:ascii="Cambria" w:eastAsia="Cambria" w:hAnsi="Cambria" w:cs="Cambria"/>
-        </w:rPr>
-        <w:t>Akaeze</w:t>
-      </w:r>
-      <w:proofErr w:type="spellEnd"/>
-      <w:r>
-        <w:rPr>
-          <w:rFonts w:ascii="Cambria" w:eastAsia="Cambria" w:hAnsi="Cambria" w:cs="Cambria"/>
-        </w:rPr>
-        <w:t xml:space="preserve">, and Jamie Heng-Chieh Wu. “More Care, More Workers? Gauging the Impact of Child Care Access on Labor Force Participation.” </w:t>
+        <w:t xml:space="preserve">, Hope O. Akaeze, Holli A. Schlukebir, Steven R. Miller, Henry O. Akaeze, and Jamie Heng-Chieh Wu. “More Care, More Workers? Gauging the Impact of Child Care Access on Labor Force Participation.” </w:t>
       </w:r>
       <w:r>
         <w:rPr>
@@ -954,35 +904,7 @@
         <w:rPr>
           <w:rFonts w:ascii="Cambria" w:eastAsia="Cambria" w:hAnsi="Cambria" w:cs="Cambria"/>
         </w:rPr>
-        <w:t xml:space="preserve">, &amp; Mark Brennen </w:t>
-      </w:r>
-      <w:proofErr w:type="spellStart"/>
-      <w:r>
-        <w:rPr>
-          <w:rFonts w:ascii="Cambria" w:eastAsia="Cambria" w:hAnsi="Cambria" w:cs="Cambria"/>
-        </w:rPr>
-        <w:t>VanderVeen</w:t>
-      </w:r>
-      <w:proofErr w:type="spellEnd"/>
-      <w:r>
-        <w:rPr>
-          <w:rFonts w:ascii="Cambria" w:eastAsia="Cambria" w:hAnsi="Cambria" w:cs="Cambria"/>
-        </w:rPr>
-        <w:t xml:space="preserve">. “Applying Transreading in Teaching </w:t>
-      </w:r>
-      <w:proofErr w:type="spellStart"/>
-      <w:r>
-        <w:rPr>
-          <w:rFonts w:ascii="Cambria" w:eastAsia="Cambria" w:hAnsi="Cambria" w:cs="Cambria"/>
-        </w:rPr>
-        <w:t>Literaturphilosophie</w:t>
-      </w:r>
-      <w:proofErr w:type="spellEnd"/>
-      <w:r>
-        <w:rPr>
-          <w:rFonts w:ascii="Cambria" w:eastAsia="Cambria" w:hAnsi="Cambria" w:cs="Cambria"/>
-        </w:rPr>
-        <w:t xml:space="preserve">: Laozi, Kierkegaard, Nietzsche, and Olav H. Hauge.” Chapter in </w:t>
+        <w:t xml:space="preserve">, &amp; Mark Brennen VanderVeen. “Applying Transreading in Teaching Literaturphilosophie: Laozi, Kierkegaard, Nietzsche, and Olav H. Hauge.” Chapter in </w:t>
       </w:r>
       <w:r>
         <w:rPr>
@@ -1122,33 +1044,11 @@
           <w:bCs/>
         </w:rPr>
       </w:pPr>
-      <w:proofErr w:type="spellStart"/>
-      <w:r>
-        <w:rPr>
-          <w:rFonts w:ascii="Cambria" w:eastAsia="Cambria" w:hAnsi="Cambria" w:cs="Cambria"/>
-        </w:rPr>
-        <w:t>Movassaghi</w:t>
-      </w:r>
-      <w:proofErr w:type="spellEnd"/>
-      <w:r>
-        <w:rPr>
-          <w:rFonts w:ascii="Cambria" w:eastAsia="Cambria" w:hAnsi="Cambria" w:cs="Cambria"/>
-        </w:rPr>
-        <w:t xml:space="preserve"> A., Karve Z., </w:t>
-      </w:r>
-      <w:proofErr w:type="spellStart"/>
-      <w:r>
-        <w:rPr>
-          <w:rFonts w:ascii="Cambria" w:eastAsia="Cambria" w:hAnsi="Cambria" w:cs="Cambria"/>
-        </w:rPr>
-        <w:t>Calpey</w:t>
-      </w:r>
-      <w:proofErr w:type="spellEnd"/>
-      <w:r>
-        <w:rPr>
-          <w:rFonts w:ascii="Cambria" w:eastAsia="Cambria" w:hAnsi="Cambria" w:cs="Cambria"/>
-        </w:rPr>
-        <w:t xml:space="preserve"> J., </w:t>
+      <w:r>
+        <w:rPr>
+          <w:rFonts w:ascii="Cambria" w:eastAsia="Cambria" w:hAnsi="Cambria" w:cs="Cambria"/>
+        </w:rPr>
+        <w:t xml:space="preserve">Movassaghi A., Karve Z., Calpey J., </w:t>
       </w:r>
       <w:r>
         <w:rPr>
@@ -1161,21 +1061,7 @@
         <w:rPr>
           <w:rFonts w:ascii="Cambria" w:eastAsia="Cambria" w:hAnsi="Cambria" w:cs="Cambria"/>
         </w:rPr>
-        <w:t xml:space="preserve">, Childers J.T., Lack B.T., </w:t>
-      </w:r>
-      <w:proofErr w:type="gramStart"/>
-      <w:r>
-        <w:rPr>
-          <w:rFonts w:ascii="Cambria" w:eastAsia="Cambria" w:hAnsi="Cambria" w:cs="Cambria"/>
-        </w:rPr>
-        <w:t>Lubert .J</w:t>
-      </w:r>
-      <w:proofErr w:type="gramEnd"/>
-      <w:r>
-        <w:rPr>
-          <w:rFonts w:ascii="Cambria" w:eastAsia="Cambria" w:hAnsi="Cambria" w:cs="Cambria"/>
-        </w:rPr>
-        <w:t xml:space="preserve">, Sabesan V.J. “Cost-Effectiveness of Surgical Treatment Options for Massive Rotator Cuff Tears.” </w:t>
+        <w:t xml:space="preserve">, Childers J.T., Lack B.T., Lubert .J, Sabesan V.J. “Cost-Effectiveness of Surgical Treatment Options for Massive Rotator Cuff Tears.” </w:t>
       </w:r>
       <w:r>
         <w:rPr>
@@ -1592,33 +1478,8 @@
           <w:rFonts w:ascii="Cambria" w:eastAsia="Cambria" w:hAnsi="Cambria" w:cs="Cambria"/>
           <w:lang w:val="es-AR"/>
         </w:rPr>
-        <w:t xml:space="preserve">TA, EC 450 — </w:t>
-      </w:r>
-      <w:proofErr w:type="spellStart"/>
-      <w:r>
-        <w:rPr>
-          <w:rFonts w:ascii="Cambria" w:eastAsia="Cambria" w:hAnsi="Cambria" w:cs="Cambria"/>
-          <w:lang w:val="es-AR"/>
-        </w:rPr>
-        <w:t>Environmental</w:t>
-      </w:r>
-      <w:proofErr w:type="spellEnd"/>
-      <w:r>
-        <w:rPr>
-          <w:rFonts w:ascii="Cambria" w:eastAsia="Cambria" w:hAnsi="Cambria" w:cs="Cambria"/>
-          <w:lang w:val="es-AR"/>
-        </w:rPr>
-        <w:t xml:space="preserve"> </w:t>
-      </w:r>
-      <w:proofErr w:type="spellStart"/>
-      <w:r>
-        <w:rPr>
-          <w:rFonts w:ascii="Cambria" w:eastAsia="Cambria" w:hAnsi="Cambria" w:cs="Cambria"/>
-          <w:lang w:val="es-AR"/>
-        </w:rPr>
-        <w:t>Economics</w:t>
-      </w:r>
-      <w:proofErr w:type="spellEnd"/>
+        <w:t>TA, EC 450 — Environmental Economics</w:t>
+      </w:r>
       <w:r>
         <w:rPr>
           <w:rFonts w:ascii="Cambria" w:eastAsia="Cambria" w:hAnsi="Cambria" w:cs="Cambria"/>
@@ -1652,17 +1513,8 @@
           <w:rFonts w:ascii="Cambria" w:eastAsia="Cambria" w:hAnsi="Cambria" w:cs="Cambria"/>
           <w:lang w:val="es-AR"/>
         </w:rPr>
-        <w:t xml:space="preserve">TA, EC 499 — Senior </w:t>
-      </w:r>
-      <w:proofErr w:type="spellStart"/>
-      <w:r>
-        <w:rPr>
-          <w:rFonts w:ascii="Cambria" w:eastAsia="Cambria" w:hAnsi="Cambria" w:cs="Cambria"/>
-          <w:lang w:val="es-AR"/>
-        </w:rPr>
-        <w:t>Seminar</w:t>
-      </w:r>
-      <w:proofErr w:type="spellEnd"/>
+        <w:t>TA, EC 499 — Senior Seminar</w:t>
+      </w:r>
       <w:r>
         <w:rPr>
           <w:rFonts w:ascii="Cambria" w:eastAsia="Cambria" w:hAnsi="Cambria" w:cs="Cambria"/>
@@ -2426,21 +2278,7 @@
         <w:rPr>
           <w:rFonts w:ascii="Cambria" w:eastAsia="Cambria" w:hAnsi="Cambria" w:cs="Cambria"/>
         </w:rPr>
-        <w:t xml:space="preserve">      R/RStudio, LaTeX, Git/</w:t>
-      </w:r>
-      <w:proofErr w:type="spellStart"/>
-      <w:r>
-        <w:rPr>
-          <w:rFonts w:ascii="Cambria" w:eastAsia="Cambria" w:hAnsi="Cambria" w:cs="Cambria"/>
-        </w:rPr>
-        <w:t>Github</w:t>
-      </w:r>
-      <w:proofErr w:type="spellEnd"/>
-      <w:r>
-        <w:rPr>
-          <w:rFonts w:ascii="Cambria" w:eastAsia="Cambria" w:hAnsi="Cambria" w:cs="Cambria"/>
-        </w:rPr>
-        <w:t xml:space="preserve">, Tableau, Python, Stata </w:t>
+        <w:t xml:space="preserve">      R/RStudio, LaTeX, Git/Github, Tableau, Python, Stata </w:t>
       </w:r>
     </w:p>
     <w:p>

</xml_diff>

<commit_message>
Mild updates to CV, spacing.
</commit_message>
<xml_diff>
--- a/res/JReaves_CV.docx
+++ b/res/JReaves_CV.docx
@@ -38,7 +38,15 @@
           <w:b/>
           <w:bCs/>
         </w:rPr>
-        <w:t xml:space="preserve"> September</w:t>
+        <w:t xml:space="preserve"> </w:t>
+      </w:r>
+      <w:r>
+        <w:rPr>
+          <w:rFonts w:ascii="Cambria" w:eastAsia="Cambria" w:hAnsi="Cambria" w:cs="Cambria"/>
+          <w:b/>
+          <w:bCs/>
+        </w:rPr>
+        <w:t>October</w:t>
       </w:r>
       <w:r>
         <w:rPr>
@@ -292,7 +300,19 @@
         <w:rPr>
           <w:rFonts w:ascii="Cambria" w:eastAsia="Cambria" w:hAnsi="Cambria" w:cs="Cambria"/>
         </w:rPr>
-        <w:t>Urban Economics, Industrial Organization, Environmental Economics</w:t>
+        <w:t xml:space="preserve">Urban Economics, </w:t>
+      </w:r>
+      <w:r>
+        <w:rPr>
+          <w:rFonts w:ascii="Cambria" w:eastAsia="Cambria" w:hAnsi="Cambria" w:cs="Cambria"/>
+        </w:rPr>
+        <w:t xml:space="preserve">Industrial Organization, </w:t>
+      </w:r>
+      <w:r>
+        <w:rPr>
+          <w:rFonts w:ascii="Cambria" w:eastAsia="Cambria" w:hAnsi="Cambria" w:cs="Cambria"/>
+        </w:rPr>
+        <w:t>Environmental Economics</w:t>
       </w:r>
     </w:p>
     <w:p>
@@ -346,28 +366,14 @@
         <w:rPr>
           <w:rFonts w:ascii="Cambria" w:eastAsia="Cambria" w:hAnsi="Cambria" w:cs="Cambria"/>
         </w:rPr>
-        <w:t xml:space="preserve">Ph.D. | Economics, Michigan State </w:t>
-      </w:r>
-      <w:proofErr w:type="gramStart"/>
-      <w:r>
-        <w:rPr>
-          <w:rFonts w:ascii="Cambria" w:eastAsia="Cambria" w:hAnsi="Cambria" w:cs="Cambria"/>
-        </w:rPr>
-        <w:t xml:space="preserve">University </w:t>
+        <w:t xml:space="preserve">Ph.D. | Economics, Michigan State University </w:t>
       </w:r>
       <w:r>
         <w:rPr>
           <w:rFonts w:ascii="Cambria" w:eastAsia="Cambria" w:hAnsi="Cambria" w:cs="Cambria"/>
         </w:rPr>
         <w:tab/>
-        <w:t>(</w:t>
-      </w:r>
-      <w:proofErr w:type="gramEnd"/>
-      <w:r>
-        <w:rPr>
-          <w:rFonts w:ascii="Cambria" w:eastAsia="Cambria" w:hAnsi="Cambria" w:cs="Cambria"/>
-        </w:rPr>
-        <w:t>exp.) 2027</w:t>
+        <w:t>(exp.) 2027</w:t>
       </w:r>
     </w:p>
     <w:p>
@@ -732,7 +738,7 @@
           <w:b/>
           <w:bCs/>
         </w:rPr>
-        <w:t>Peer-Reviewed Publications (Beyond Economics)</w:t>
+        <w:t>Interdisciplinary Publications</w:t>
       </w:r>
     </w:p>
     <w:p>
@@ -1584,6 +1590,37 @@
         <w:rPr>
           <w:rFonts w:ascii="Cambria" w:eastAsia="Cambria" w:hAnsi="Cambria" w:cs="Cambria"/>
         </w:rPr>
+        <w:t>Interdisciplinary Inquiry and Teaching (IIT)</w:t>
+      </w:r>
+      <w:r>
+        <w:rPr>
+          <w:rFonts w:ascii="Cambria" w:eastAsia="Cambria" w:hAnsi="Cambria" w:cs="Cambria"/>
+        </w:rPr>
+        <w:t xml:space="preserve"> Fellowship | MSU</w:t>
+      </w:r>
+      <w:r>
+        <w:rPr>
+          <w:rFonts w:ascii="Cambria" w:eastAsia="Cambria" w:hAnsi="Cambria" w:cs="Cambria"/>
+        </w:rPr>
+        <w:tab/>
+        <w:t>FA24-SP25</w:t>
+      </w:r>
+    </w:p>
+    <w:p>
+      <w:pPr>
+        <w:tabs>
+          <w:tab w:val="right" w:pos="9360"/>
+        </w:tabs>
+        <w:spacing w:after="0" w:line="240" w:lineRule="auto"/>
+        <w:ind w:left="270"/>
+        <w:rPr>
+          <w:rFonts w:ascii="Cambria" w:eastAsia="Cambria" w:hAnsi="Cambria" w:cs="Cambria"/>
+        </w:rPr>
+      </w:pPr>
+      <w:r>
+        <w:rPr>
+          <w:rFonts w:ascii="Cambria" w:eastAsia="Cambria" w:hAnsi="Cambria" w:cs="Cambria"/>
+        </w:rPr>
         <w:t xml:space="preserve">TA, EC 201 — Introduction to Microeconomics </w:t>
       </w:r>
       <w:r>
@@ -1888,7 +1925,19 @@
         <w:rPr>
           <w:rFonts w:ascii="Cambria" w:eastAsia="Cambria" w:hAnsi="Cambria" w:cs="Cambria"/>
         </w:rPr>
-        <w:t>RA, Jamie Wu &amp; Steven Miller (CEPR) | MSU</w:t>
+        <w:t>RA, Jamie Wu &amp; Steven Miller (</w:t>
+      </w:r>
+      <w:r>
+        <w:rPr>
+          <w:rFonts w:ascii="Cambria" w:eastAsia="Cambria" w:hAnsi="Cambria" w:cs="Cambria"/>
+        </w:rPr>
+        <w:t>EREC</w:t>
+      </w:r>
+      <w:r>
+        <w:rPr>
+          <w:rFonts w:ascii="Cambria" w:eastAsia="Cambria" w:hAnsi="Cambria" w:cs="Cambria"/>
+        </w:rPr>
+        <w:t>) | MSU</w:t>
       </w:r>
       <w:r>
         <w:rPr>
@@ -1958,21 +2007,6 @@
           <w:rFonts w:ascii="Cambria" w:eastAsia="Cambria" w:hAnsi="Cambria" w:cs="Cambria"/>
           <w:b/>
           <w:bCs/>
-          <w:sz w:val="18"/>
-          <w:szCs w:val="18"/>
-        </w:rPr>
-      </w:pPr>
-    </w:p>
-    <w:p>
-      <w:pPr>
-        <w:tabs>
-          <w:tab w:val="right" w:pos="9360"/>
-        </w:tabs>
-        <w:spacing w:after="0" w:line="240" w:lineRule="auto"/>
-        <w:rPr>
-          <w:rFonts w:ascii="Cambria" w:eastAsia="Cambria" w:hAnsi="Cambria" w:cs="Cambria"/>
-          <w:b/>
-          <w:bCs/>
         </w:rPr>
       </w:pPr>
       <w:r>
@@ -2004,37 +2038,6 @@
         </w:rPr>
         <w:lastRenderedPageBreak/>
         <w:t>Service</w:t>
-      </w:r>
-    </w:p>
-    <w:p>
-      <w:pPr>
-        <w:tabs>
-          <w:tab w:val="right" w:pos="9360"/>
-        </w:tabs>
-        <w:spacing w:after="0" w:line="240" w:lineRule="auto"/>
-        <w:ind w:left="270"/>
-        <w:rPr>
-          <w:rFonts w:ascii="Cambria" w:eastAsia="Cambria" w:hAnsi="Cambria" w:cs="Cambria"/>
-        </w:rPr>
-      </w:pPr>
-      <w:r>
-        <w:rPr>
-          <w:rFonts w:ascii="Cambria" w:eastAsia="Cambria" w:hAnsi="Cambria" w:cs="Cambria"/>
-        </w:rPr>
-        <w:t>Interdisciplinary Inquiry and Teaching (IIT)</w:t>
-      </w:r>
-      <w:r>
-        <w:rPr>
-          <w:rFonts w:ascii="Cambria" w:eastAsia="Cambria" w:hAnsi="Cambria" w:cs="Cambria"/>
-        </w:rPr>
-        <w:t xml:space="preserve"> Fellowship | MSU</w:t>
-      </w:r>
-      <w:r>
-        <w:rPr>
-          <w:rFonts w:ascii="Cambria" w:eastAsia="Cambria" w:hAnsi="Cambria" w:cs="Cambria"/>
-        </w:rPr>
-        <w:tab/>
-        <w:t>2024-2025</w:t>
       </w:r>
     </w:p>
     <w:p>
@@ -3737,4 +3740,10 @@
     <ds:schemaRef ds:uri="http://schemas.openxmlformats.org/officeDocument/2006/relationships"/>
   </ds:schemaRefs>
 </ds:datastoreItem>
+</file>
+
+<file path=docMetadata/LabelInfo.xml><?xml version="1.0" encoding="utf-8"?>
+<clbl:labelList xmlns:clbl="http://schemas.microsoft.com/office/2020/mipLabelMetadata">
+  <clbl:label id="{22177130-642f-41d9-9211-74237ad5687d}" enabled="0" method="" siteId="{22177130-642f-41d9-9211-74237ad5687d}" removed="1"/>
+</clbl:labelList>
 </file>
</xml_diff>

<commit_message>
I can finally upload my draft!
</commit_message>
<xml_diff>
--- a/res/JReaves_CV.docx
+++ b/res/JReaves_CV.docx
@@ -245,11 +245,19 @@
               </w:rPr>
               <w:br/>
             </w:r>
+            <w:proofErr w:type="spellStart"/>
             <w:r>
               <w:rPr>
                 <w:rFonts w:ascii="Cambria" w:eastAsia="Cambria" w:hAnsi="Cambria" w:cs="Cambria"/>
               </w:rPr>
-              <w:t xml:space="preserve">ORCiD ID: </w:t>
+              <w:t>ORCiD</w:t>
+            </w:r>
+            <w:proofErr w:type="spellEnd"/>
+            <w:r>
+              <w:rPr>
+                <w:rFonts w:ascii="Cambria" w:eastAsia="Cambria" w:hAnsi="Cambria" w:cs="Cambria"/>
+              </w:rPr>
+              <w:t xml:space="preserve"> ID: </w:t>
             </w:r>
             <w:hyperlink r:id="rId7">
               <w:r>
@@ -487,50 +495,7 @@
           <w:i/>
           <w:iCs/>
         </w:rPr>
-        <w:br/>
-      </w:r>
-    </w:p>
-    <w:p>
-      <w:pPr>
-        <w:tabs>
-          <w:tab w:val="right" w:pos="9360"/>
-        </w:tabs>
-        <w:spacing w:after="0" w:line="240" w:lineRule="auto"/>
-        <w:rPr>
-          <w:rFonts w:ascii="Cambria" w:eastAsia="Cambria" w:hAnsi="Cambria" w:cs="Cambria"/>
-          <w:b/>
-          <w:bCs/>
-        </w:rPr>
-      </w:pPr>
-      <w:r>
-        <w:rPr>
-          <w:rFonts w:ascii="Cambria" w:eastAsia="Cambria" w:hAnsi="Cambria" w:cs="Cambria"/>
-          <w:b/>
-          <w:bCs/>
-        </w:rPr>
-        <w:t>Working Papers</w:t>
-      </w:r>
-    </w:p>
-    <w:p>
-      <w:pPr>
-        <w:tabs>
-          <w:tab w:val="right" w:pos="9360"/>
-        </w:tabs>
-        <w:spacing w:after="0" w:line="240" w:lineRule="auto"/>
-        <w:ind w:left="270"/>
-        <w:rPr>
-          <w:rFonts w:ascii="Cambria" w:eastAsia="Cambria" w:hAnsi="Cambria" w:cs="Cambria"/>
-          <w:sz w:val="18"/>
-          <w:szCs w:val="18"/>
-        </w:rPr>
-      </w:pPr>
-      <w:r>
-        <w:rPr>
-          <w:rFonts w:ascii="Cambria" w:eastAsia="Cambria" w:hAnsi="Cambria" w:cs="Cambria"/>
-          <w:i/>
-          <w:iCs/>
-        </w:rPr>
-        <w:t xml:space="preserve">“Out of Bounds: An Examination of Portland, OR’s Urban Growth Boundary” </w:t>
+        <w:t xml:space="preserve"> </w:t>
       </w:r>
       <w:hyperlink r:id="rId8">
         <w:r>
@@ -543,18 +508,45 @@
           <w:t>[LINK]</w:t>
         </w:r>
       </w:hyperlink>
-    </w:p>
-    <w:p>
-      <w:pPr>
-        <w:tabs>
-          <w:tab w:val="right" w:pos="9360"/>
-        </w:tabs>
-        <w:spacing w:after="0" w:line="240" w:lineRule="auto"/>
-        <w:ind w:left="270"/>
-        <w:rPr>
-          <w:rFonts w:ascii="Cambria" w:eastAsia="Cambria" w:hAnsi="Cambria" w:cs="Cambria"/>
-          <w:b/>
-          <w:bCs/>
+      <w:r>
+        <w:rPr>
+          <w:rFonts w:ascii="Cambria" w:eastAsia="Cambria" w:hAnsi="Cambria" w:cs="Cambria"/>
+          <w:i/>
+          <w:iCs/>
+        </w:rPr>
+        <w:br/>
+      </w:r>
+    </w:p>
+    <w:p>
+      <w:pPr>
+        <w:tabs>
+          <w:tab w:val="right" w:pos="9360"/>
+        </w:tabs>
+        <w:spacing w:after="0" w:line="240" w:lineRule="auto"/>
+        <w:rPr>
+          <w:rFonts w:ascii="Cambria" w:eastAsia="Cambria" w:hAnsi="Cambria" w:cs="Cambria"/>
+          <w:b/>
+          <w:bCs/>
+        </w:rPr>
+      </w:pPr>
+      <w:r>
+        <w:rPr>
+          <w:rFonts w:ascii="Cambria" w:eastAsia="Cambria" w:hAnsi="Cambria" w:cs="Cambria"/>
+          <w:b/>
+          <w:bCs/>
+        </w:rPr>
+        <w:t>Working Papers</w:t>
+      </w:r>
+    </w:p>
+    <w:p>
+      <w:pPr>
+        <w:tabs>
+          <w:tab w:val="right" w:pos="9360"/>
+        </w:tabs>
+        <w:spacing w:after="0" w:line="240" w:lineRule="auto"/>
+        <w:ind w:left="270"/>
+        <w:rPr>
+          <w:rFonts w:ascii="Cambria" w:eastAsia="Cambria" w:hAnsi="Cambria" w:cs="Cambria"/>
           <w:sz w:val="18"/>
           <w:szCs w:val="18"/>
         </w:rPr>
@@ -565,6 +557,41 @@
           <w:i/>
           <w:iCs/>
         </w:rPr>
+        <w:t xml:space="preserve">“Out of Bounds: An Examination of Portland, OR’s Urban Growth Boundary” </w:t>
+      </w:r>
+      <w:hyperlink r:id="rId9">
+        <w:r>
+          <w:rPr>
+            <w:rFonts w:ascii="Cambria" w:eastAsia="Cambria" w:hAnsi="Cambria" w:cs="Cambria"/>
+            <w:color w:val="1155CC"/>
+            <w:sz w:val="18"/>
+            <w:szCs w:val="18"/>
+          </w:rPr>
+          <w:t>[LINK]</w:t>
+        </w:r>
+      </w:hyperlink>
+    </w:p>
+    <w:p>
+      <w:pPr>
+        <w:tabs>
+          <w:tab w:val="right" w:pos="9360"/>
+        </w:tabs>
+        <w:spacing w:after="0" w:line="240" w:lineRule="auto"/>
+        <w:ind w:left="270"/>
+        <w:rPr>
+          <w:rFonts w:ascii="Cambria" w:eastAsia="Cambria" w:hAnsi="Cambria" w:cs="Cambria"/>
+          <w:b/>
+          <w:bCs/>
+          <w:sz w:val="18"/>
+          <w:szCs w:val="18"/>
+        </w:rPr>
+      </w:pPr>
+      <w:r>
+        <w:rPr>
+          <w:rFonts w:ascii="Cambria" w:eastAsia="Cambria" w:hAnsi="Cambria" w:cs="Cambria"/>
+          <w:i/>
+          <w:iCs/>
+        </w:rPr>
         <w:t>“Trip-taking and Amenity Exposure”</w:t>
       </w:r>
       <w:r>
@@ -573,7 +600,7 @@
         </w:rPr>
         <w:t xml:space="preserve"> (w/ </w:t>
       </w:r>
-      <w:hyperlink r:id="rId9">
+      <w:hyperlink r:id="rId10">
         <w:r>
           <w:rPr>
             <w:rFonts w:ascii="Cambria" w:eastAsia="Cambria" w:hAnsi="Cambria" w:cs="Cambria"/>
@@ -588,7 +615,7 @@
         </w:rPr>
         <w:t xml:space="preserve">) </w:t>
       </w:r>
-      <w:hyperlink r:id="rId10">
+      <w:hyperlink r:id="rId11">
         <w:r>
           <w:rPr>
             <w:rFonts w:ascii="Cambria" w:eastAsia="Cambria" w:hAnsi="Cambria" w:cs="Cambria"/>
@@ -623,7 +650,7 @@
         </w:rPr>
         <w:t xml:space="preserve">“Where to Next? Mobile Broadband and Business Dynamics” </w:t>
       </w:r>
-      <w:hyperlink r:id="rId11">
+      <w:hyperlink r:id="rId12">
         <w:r>
           <w:rPr>
             <w:rFonts w:ascii="Cambria" w:eastAsia="Cambria" w:hAnsi="Cambria" w:cs="Cambria"/>
@@ -698,7 +725,7 @@
         </w:rPr>
         <w:t xml:space="preserve"> (w/ </w:t>
       </w:r>
-      <w:hyperlink r:id="rId12">
+      <w:hyperlink r:id="rId13">
         <w:r>
           <w:rPr>
             <w:rFonts w:ascii="Cambria" w:eastAsia="Cambria" w:hAnsi="Cambria" w:cs="Cambria"/>
@@ -784,87 +811,6 @@
           <w:rFonts w:ascii="Cambria" w:eastAsia="Cambria" w:hAnsi="Cambria" w:cs="Cambria"/>
         </w:rPr>
         <w:t xml:space="preserve"> Forthcoming.  Accessible </w:t>
-      </w:r>
-      <w:hyperlink r:id="rId13">
-        <w:r>
-          <w:rPr>
-            <w:rFonts w:ascii="Cambria" w:eastAsia="Cambria" w:hAnsi="Cambria" w:cs="Cambria"/>
-            <w:color w:val="1155CC"/>
-          </w:rPr>
-          <w:t>here</w:t>
-        </w:r>
-      </w:hyperlink>
-      <w:r>
-        <w:rPr>
-          <w:rFonts w:ascii="Cambria" w:eastAsia="Cambria" w:hAnsi="Cambria" w:cs="Cambria"/>
-        </w:rPr>
-        <w:t>.</w:t>
-      </w:r>
-    </w:p>
-    <w:p>
-      <w:pPr>
-        <w:tabs>
-          <w:tab w:val="right" w:pos="9360"/>
-        </w:tabs>
-        <w:spacing w:after="0" w:line="240" w:lineRule="auto"/>
-        <w:ind w:left="270"/>
-        <w:rPr>
-          <w:rFonts w:ascii="Cambria" w:eastAsia="Cambria" w:hAnsi="Cambria" w:cs="Cambria"/>
-          <w:u w:val="single"/>
-        </w:rPr>
-      </w:pPr>
-    </w:p>
-    <w:p>
-      <w:pPr>
-        <w:tabs>
-          <w:tab w:val="right" w:pos="9360"/>
-        </w:tabs>
-        <w:spacing w:after="0" w:line="240" w:lineRule="auto"/>
-        <w:ind w:left="270"/>
-        <w:rPr>
-          <w:rFonts w:ascii="Cambria" w:eastAsia="Cambria" w:hAnsi="Cambria" w:cs="Cambria"/>
-        </w:rPr>
-      </w:pPr>
-      <w:r>
-        <w:rPr>
-          <w:rFonts w:ascii="Cambria" w:eastAsia="Cambria" w:hAnsi="Cambria" w:cs="Cambria"/>
-          <w:u w:val="single"/>
-        </w:rPr>
-        <w:t>Reaves, John</w:t>
-      </w:r>
-      <w:r>
-        <w:rPr>
-          <w:rFonts w:ascii="Cambria" w:eastAsia="Cambria" w:hAnsi="Cambria" w:cs="Cambria"/>
-        </w:rPr>
-        <w:t xml:space="preserve">, Hope O. Akaeze, Holli A. Schlukebir, Steven R. Miller, Henry O. Akaeze, and Jamie Heng-Chieh Wu. “More Care, More Workers? Gauging the Impact of Child Care Access on Labor Force Participation.” </w:t>
-      </w:r>
-      <w:r>
-        <w:rPr>
-          <w:rFonts w:ascii="Cambria" w:eastAsia="Cambria" w:hAnsi="Cambria" w:cs="Cambria"/>
-          <w:i/>
-          <w:iCs/>
-        </w:rPr>
-        <w:t>MDPI Social Sciences</w:t>
-      </w:r>
-      <w:r>
-        <w:rPr>
-          <w:rFonts w:ascii="Cambria" w:eastAsia="Cambria" w:hAnsi="Cambria" w:cs="Cambria"/>
-        </w:rPr>
-        <w:t>, July 2025</w:t>
-      </w:r>
-      <w:r>
-        <w:rPr>
-          <w:rFonts w:ascii="Cambria" w:eastAsia="Cambria" w:hAnsi="Cambria" w:cs="Cambria"/>
-          <w:i/>
-          <w:iCs/>
-        </w:rPr>
-        <w:t xml:space="preserve">. </w:t>
-      </w:r>
-      <w:r>
-        <w:rPr>
-          <w:rFonts w:ascii="Cambria" w:eastAsia="Cambria" w:hAnsi="Cambria" w:cs="Cambria"/>
-        </w:rPr>
-        <w:t xml:space="preserve">Accessible </w:t>
       </w:r>
       <w:hyperlink r:id="rId14">
         <w:r>
@@ -891,40 +837,61 @@
         <w:ind w:left="270"/>
         <w:rPr>
           <w:rFonts w:ascii="Cambria" w:eastAsia="Cambria" w:hAnsi="Cambria" w:cs="Cambria"/>
-          <w:sz w:val="18"/>
-          <w:szCs w:val="18"/>
-        </w:rPr>
-      </w:pPr>
-    </w:p>
-    <w:p>
-      <w:pPr>
-        <w:tabs>
-          <w:tab w:val="right" w:pos="9360"/>
-        </w:tabs>
-        <w:spacing w:after="0" w:line="240" w:lineRule="auto"/>
-        <w:ind w:left="270"/>
-        <w:rPr>
-          <w:rFonts w:ascii="Cambria" w:eastAsia="Cambria" w:hAnsi="Cambria" w:cs="Cambria"/>
-        </w:rPr>
-      </w:pPr>
-      <w:r>
-        <w:rPr>
-          <w:rFonts w:ascii="Cambria" w:eastAsia="Cambria" w:hAnsi="Cambria" w:cs="Cambria"/>
-        </w:rPr>
-        <w:t xml:space="preserve">Zhang, Huiwen Helen, Steven Buchele, Devin P. Raine, </w:t>
-      </w:r>
-      <w:r>
-        <w:rPr>
-          <w:rFonts w:ascii="Cambria" w:eastAsia="Cambria" w:hAnsi="Cambria" w:cs="Cambria"/>
           <w:u w:val="single"/>
         </w:rPr>
-        <w:t>John T. Reaves</w:t>
-      </w:r>
-      <w:r>
-        <w:rPr>
-          <w:rFonts w:ascii="Cambria" w:eastAsia="Cambria" w:hAnsi="Cambria" w:cs="Cambria"/>
-        </w:rPr>
-        <w:t xml:space="preserve">, &amp; Mark Brennen VanderVeen. “Applying Transreading in Teaching Literaturphilosophie: Laozi, Kierkegaard, Nietzsche, and Olav H. Hauge.” Chapter in </w:t>
+      </w:pPr>
+    </w:p>
+    <w:p>
+      <w:pPr>
+        <w:tabs>
+          <w:tab w:val="right" w:pos="9360"/>
+        </w:tabs>
+        <w:spacing w:after="0" w:line="240" w:lineRule="auto"/>
+        <w:ind w:left="270"/>
+        <w:rPr>
+          <w:rFonts w:ascii="Cambria" w:eastAsia="Cambria" w:hAnsi="Cambria" w:cs="Cambria"/>
+        </w:rPr>
+      </w:pPr>
+      <w:r>
+        <w:rPr>
+          <w:rFonts w:ascii="Cambria" w:eastAsia="Cambria" w:hAnsi="Cambria" w:cs="Cambria"/>
+          <w:u w:val="single"/>
+        </w:rPr>
+        <w:t>Reaves, John</w:t>
+      </w:r>
+      <w:r>
+        <w:rPr>
+          <w:rFonts w:ascii="Cambria" w:eastAsia="Cambria" w:hAnsi="Cambria" w:cs="Cambria"/>
+        </w:rPr>
+        <w:t xml:space="preserve">, Hope O. </w:t>
+      </w:r>
+      <w:proofErr w:type="spellStart"/>
+      <w:r>
+        <w:rPr>
+          <w:rFonts w:ascii="Cambria" w:eastAsia="Cambria" w:hAnsi="Cambria" w:cs="Cambria"/>
+        </w:rPr>
+        <w:t>Akaeze</w:t>
+      </w:r>
+      <w:proofErr w:type="spellEnd"/>
+      <w:r>
+        <w:rPr>
+          <w:rFonts w:ascii="Cambria" w:eastAsia="Cambria" w:hAnsi="Cambria" w:cs="Cambria"/>
+        </w:rPr>
+        <w:t xml:space="preserve">, Holli A. Schlukebir, Steven R. Miller, Henry O. </w:t>
+      </w:r>
+      <w:proofErr w:type="spellStart"/>
+      <w:r>
+        <w:rPr>
+          <w:rFonts w:ascii="Cambria" w:eastAsia="Cambria" w:hAnsi="Cambria" w:cs="Cambria"/>
+        </w:rPr>
+        <w:t>Akaeze</w:t>
+      </w:r>
+      <w:proofErr w:type="spellEnd"/>
+      <w:r>
+        <w:rPr>
+          <w:rFonts w:ascii="Cambria" w:eastAsia="Cambria" w:hAnsi="Cambria" w:cs="Cambria"/>
+        </w:rPr>
+        <w:t xml:space="preserve">, and Jamie Heng-Chieh Wu. “More Care, More Workers? Gauging the Impact of Child Care Access on Labor Force Participation.” </w:t>
       </w:r>
       <w:r>
         <w:rPr>
@@ -932,19 +899,33 @@
           <w:i/>
           <w:iCs/>
         </w:rPr>
-        <w:t>Handbook of Research on Multilingual and Multicultural Perspectives on Higher Education and Implications for Teaching</w:t>
-      </w:r>
-      <w:r>
-        <w:rPr>
-          <w:rFonts w:ascii="Cambria" w:eastAsia="Cambria" w:hAnsi="Cambria" w:cs="Cambria"/>
-        </w:rPr>
-        <w:t xml:space="preserve">, 2022. Information accessible </w:t>
+        <w:t>MDPI Social Sciences</w:t>
+      </w:r>
+      <w:r>
+        <w:rPr>
+          <w:rFonts w:ascii="Cambria" w:eastAsia="Cambria" w:hAnsi="Cambria" w:cs="Cambria"/>
+        </w:rPr>
+        <w:t>, July 2025</w:t>
+      </w:r>
+      <w:r>
+        <w:rPr>
+          <w:rFonts w:ascii="Cambria" w:eastAsia="Cambria" w:hAnsi="Cambria" w:cs="Cambria"/>
+          <w:i/>
+          <w:iCs/>
+        </w:rPr>
+        <w:t xml:space="preserve">. </w:t>
+      </w:r>
+      <w:r>
+        <w:rPr>
+          <w:rFonts w:ascii="Cambria" w:eastAsia="Cambria" w:hAnsi="Cambria" w:cs="Cambria"/>
+        </w:rPr>
+        <w:t xml:space="preserve">Accessible </w:t>
       </w:r>
       <w:hyperlink r:id="rId15">
         <w:r>
           <w:rPr>
             <w:rFonts w:ascii="Cambria" w:eastAsia="Cambria" w:hAnsi="Cambria" w:cs="Cambria"/>
-            <w:color w:val="0563C1"/>
+            <w:color w:val="1155CC"/>
           </w:rPr>
           <w:t>here</w:t>
         </w:r>
@@ -984,15 +965,49 @@
       <w:r>
         <w:rPr>
           <w:rFonts w:ascii="Cambria" w:eastAsia="Cambria" w:hAnsi="Cambria" w:cs="Cambria"/>
+        </w:rPr>
+        <w:t xml:space="preserve">Zhang, Huiwen Helen, Steven Buchele, Devin P. Raine, </w:t>
+      </w:r>
+      <w:r>
+        <w:rPr>
+          <w:rFonts w:ascii="Cambria" w:eastAsia="Cambria" w:hAnsi="Cambria" w:cs="Cambria"/>
           <w:u w:val="single"/>
         </w:rPr>
-        <w:t>Reaves, John</w:t>
-      </w:r>
-      <w:r>
-        <w:rPr>
-          <w:rFonts w:ascii="Cambria" w:eastAsia="Cambria" w:hAnsi="Cambria" w:cs="Cambria"/>
-        </w:rPr>
-        <w:t>, Timothy Flavin, Bhaskar Mitra, Mahantesh K, and Vidhyashree Nagaraju. “Assessment And Application of EEG: A Literature Review.”</w:t>
+        <w:t>John T. Reaves</w:t>
+      </w:r>
+      <w:r>
+        <w:rPr>
+          <w:rFonts w:ascii="Cambria" w:eastAsia="Cambria" w:hAnsi="Cambria" w:cs="Cambria"/>
+        </w:rPr>
+        <w:t xml:space="preserve">, &amp; Mark Brennen </w:t>
+      </w:r>
+      <w:proofErr w:type="spellStart"/>
+      <w:r>
+        <w:rPr>
+          <w:rFonts w:ascii="Cambria" w:eastAsia="Cambria" w:hAnsi="Cambria" w:cs="Cambria"/>
+        </w:rPr>
+        <w:t>VanderVeen</w:t>
+      </w:r>
+      <w:proofErr w:type="spellEnd"/>
+      <w:r>
+        <w:rPr>
+          <w:rFonts w:ascii="Cambria" w:eastAsia="Cambria" w:hAnsi="Cambria" w:cs="Cambria"/>
+        </w:rPr>
+        <w:t xml:space="preserve">. “Applying Transreading in Teaching </w:t>
+      </w:r>
+      <w:proofErr w:type="spellStart"/>
+      <w:r>
+        <w:rPr>
+          <w:rFonts w:ascii="Cambria" w:eastAsia="Cambria" w:hAnsi="Cambria" w:cs="Cambria"/>
+        </w:rPr>
+        <w:t>Literaturphilosophie</w:t>
+      </w:r>
+      <w:proofErr w:type="spellEnd"/>
+      <w:r>
+        <w:rPr>
+          <w:rFonts w:ascii="Cambria" w:eastAsia="Cambria" w:hAnsi="Cambria" w:cs="Cambria"/>
+        </w:rPr>
+        <w:t xml:space="preserve">: Laozi, Kierkegaard, Nietzsche, and Olav H. Hauge.” Chapter in </w:t>
       </w:r>
       <w:r>
         <w:rPr>
@@ -1000,13 +1015,13 @@
           <w:i/>
           <w:iCs/>
         </w:rPr>
-        <w:t xml:space="preserve"> Journal of Applied Bioinformatics &amp; Computational Biology</w:t>
-      </w:r>
-      <w:r>
-        <w:rPr>
-          <w:rFonts w:ascii="Cambria" w:eastAsia="Cambria" w:hAnsi="Cambria" w:cs="Cambria"/>
-        </w:rPr>
-        <w:t xml:space="preserve">, July 2021. Accessible </w:t>
+        <w:t>Handbook of Research on Multilingual and Multicultural Perspectives on Higher Education and Implications for Teaching</w:t>
+      </w:r>
+      <w:r>
+        <w:rPr>
+          <w:rFonts w:ascii="Cambria" w:eastAsia="Cambria" w:hAnsi="Cambria" w:cs="Cambria"/>
+        </w:rPr>
+        <w:t xml:space="preserve">, 2022. Information accessible </w:t>
       </w:r>
       <w:hyperlink r:id="rId16">
         <w:r>
@@ -1030,82 +1045,37 @@
           <w:tab w:val="right" w:pos="9360"/>
         </w:tabs>
         <w:spacing w:after="0" w:line="240" w:lineRule="auto"/>
-        <w:rPr>
-          <w:rFonts w:ascii="Cambria" w:eastAsia="Cambria" w:hAnsi="Cambria" w:cs="Cambria"/>
-          <w:b/>
-          <w:bCs/>
-        </w:rPr>
-      </w:pPr>
-      <w:r>
-        <w:rPr>
-          <w:rFonts w:ascii="Cambria" w:eastAsia="Cambria" w:hAnsi="Cambria" w:cs="Cambria"/>
-        </w:rPr>
-        <w:br/>
-      </w:r>
-      <w:r>
-        <w:rPr>
-          <w:rFonts w:ascii="Cambria" w:eastAsia="Cambria" w:hAnsi="Cambria" w:cs="Cambria"/>
-          <w:b/>
-          <w:bCs/>
-        </w:rPr>
-        <w:t xml:space="preserve">Conference/Policy Publications </w:t>
-      </w:r>
-    </w:p>
-    <w:p>
-      <w:pPr>
-        <w:tabs>
-          <w:tab w:val="right" w:pos="9360"/>
-        </w:tabs>
-        <w:spacing w:after="0" w:line="240" w:lineRule="auto"/>
-        <w:ind w:left="270"/>
-        <w:rPr>
-          <w:rFonts w:ascii="Cambria" w:eastAsia="Cambria" w:hAnsi="Cambria" w:cs="Cambria"/>
-          <w:b/>
-          <w:bCs/>
-        </w:rPr>
-      </w:pPr>
-      <w:r>
-        <w:rPr>
-          <w:rFonts w:ascii="Cambria" w:eastAsia="Cambria" w:hAnsi="Cambria" w:cs="Cambria"/>
-        </w:rPr>
-        <w:t xml:space="preserve">Movassaghi A., Karve Z., Calpey J., </w:t>
-      </w:r>
+        <w:ind w:left="270"/>
+        <w:rPr>
+          <w:rFonts w:ascii="Cambria" w:eastAsia="Cambria" w:hAnsi="Cambria" w:cs="Cambria"/>
+          <w:sz w:val="18"/>
+          <w:szCs w:val="18"/>
+        </w:rPr>
+      </w:pPr>
+    </w:p>
+    <w:p>
+      <w:pPr>
+        <w:tabs>
+          <w:tab w:val="right" w:pos="9360"/>
+        </w:tabs>
+        <w:spacing w:after="0" w:line="240" w:lineRule="auto"/>
+        <w:ind w:left="270"/>
+        <w:rPr>
+          <w:rFonts w:ascii="Cambria" w:eastAsia="Cambria" w:hAnsi="Cambria" w:cs="Cambria"/>
+        </w:rPr>
+      </w:pPr>
       <w:r>
         <w:rPr>
           <w:rFonts w:ascii="Cambria" w:eastAsia="Cambria" w:hAnsi="Cambria" w:cs="Cambria"/>
           <w:u w:val="single"/>
         </w:rPr>
-        <w:t>Reaves J.</w:t>
-      </w:r>
-      <w:r>
-        <w:rPr>
-          <w:rFonts w:ascii="Cambria" w:eastAsia="Cambria" w:hAnsi="Cambria" w:cs="Cambria"/>
-        </w:rPr>
-        <w:t>, Childers J.T., Lack B.T., Lubert</w:t>
-      </w:r>
-      <w:r>
-        <w:rPr>
-          <w:rFonts w:ascii="Cambria" w:eastAsia="Cambria" w:hAnsi="Cambria" w:cs="Cambria"/>
-        </w:rPr>
-        <w:t xml:space="preserve"> </w:t>
-      </w:r>
-      <w:r>
-        <w:rPr>
-          <w:rFonts w:ascii="Cambria" w:eastAsia="Cambria" w:hAnsi="Cambria" w:cs="Cambria"/>
-        </w:rPr>
-        <w:t>J</w:t>
-      </w:r>
-      <w:r>
-        <w:rPr>
-          <w:rFonts w:ascii="Cambria" w:eastAsia="Cambria" w:hAnsi="Cambria" w:cs="Cambria"/>
-        </w:rPr>
-        <w:t>.</w:t>
-      </w:r>
-      <w:r>
-        <w:rPr>
-          <w:rFonts w:ascii="Cambria" w:eastAsia="Cambria" w:hAnsi="Cambria" w:cs="Cambria"/>
-        </w:rPr>
-        <w:t xml:space="preserve">, Sabesan V.J. “Cost-Effectiveness of Surgical Treatment Options for Massive Rotator Cuff Tears.” </w:t>
+        <w:t>Reaves, John</w:t>
+      </w:r>
+      <w:r>
+        <w:rPr>
+          <w:rFonts w:ascii="Cambria" w:eastAsia="Cambria" w:hAnsi="Cambria" w:cs="Cambria"/>
+        </w:rPr>
+        <w:t>, Timothy Flavin, Bhaskar Mitra, Mahantesh K, and Vidhyashree Nagaraju. “Assessment And Application of EEG: A Literature Review.”</w:t>
       </w:r>
       <w:r>
         <w:rPr>
@@ -1113,13 +1083,134 @@
           <w:i/>
           <w:iCs/>
         </w:rPr>
-        <w:t>Poster presentation, Shoulder360 Annual Meeting.</w:t>
-      </w:r>
-      <w:r>
-        <w:rPr>
-          <w:rFonts w:ascii="Cambria" w:eastAsia="Cambria" w:hAnsi="Cambria" w:cs="Cambria"/>
-        </w:rPr>
-        <w:t xml:space="preserve"> Apr. 2026. </w:t>
+        <w:t xml:space="preserve"> Journal of Applied Bioinformatics &amp; Computational Biology</w:t>
+      </w:r>
+      <w:r>
+        <w:rPr>
+          <w:rFonts w:ascii="Cambria" w:eastAsia="Cambria" w:hAnsi="Cambria" w:cs="Cambria"/>
+        </w:rPr>
+        <w:t xml:space="preserve">, July 2021. Accessible </w:t>
+      </w:r>
+      <w:hyperlink r:id="rId17">
+        <w:r>
+          <w:rPr>
+            <w:rFonts w:ascii="Cambria" w:eastAsia="Cambria" w:hAnsi="Cambria" w:cs="Cambria"/>
+            <w:color w:val="0563C1"/>
+          </w:rPr>
+          <w:t>here</w:t>
+        </w:r>
+      </w:hyperlink>
+      <w:r>
+        <w:rPr>
+          <w:rFonts w:ascii="Cambria" w:eastAsia="Cambria" w:hAnsi="Cambria" w:cs="Cambria"/>
+        </w:rPr>
+        <w:t>.</w:t>
+      </w:r>
+    </w:p>
+    <w:p>
+      <w:pPr>
+        <w:tabs>
+          <w:tab w:val="right" w:pos="9360"/>
+        </w:tabs>
+        <w:spacing w:after="0" w:line="240" w:lineRule="auto"/>
+        <w:rPr>
+          <w:rFonts w:ascii="Cambria" w:eastAsia="Cambria" w:hAnsi="Cambria" w:cs="Cambria"/>
+          <w:b/>
+          <w:bCs/>
+        </w:rPr>
+      </w:pPr>
+      <w:r>
+        <w:rPr>
+          <w:rFonts w:ascii="Cambria" w:eastAsia="Cambria" w:hAnsi="Cambria" w:cs="Cambria"/>
+        </w:rPr>
+        <w:br/>
+      </w:r>
+      <w:r>
+        <w:rPr>
+          <w:rFonts w:ascii="Cambria" w:eastAsia="Cambria" w:hAnsi="Cambria" w:cs="Cambria"/>
+          <w:b/>
+          <w:bCs/>
+        </w:rPr>
+        <w:t xml:space="preserve">Conference/Policy Publications </w:t>
+      </w:r>
+    </w:p>
+    <w:p>
+      <w:pPr>
+        <w:tabs>
+          <w:tab w:val="right" w:pos="9360"/>
+        </w:tabs>
+        <w:spacing w:after="0" w:line="240" w:lineRule="auto"/>
+        <w:ind w:left="270"/>
+        <w:rPr>
+          <w:rFonts w:ascii="Cambria" w:eastAsia="Cambria" w:hAnsi="Cambria" w:cs="Cambria"/>
+          <w:b/>
+          <w:bCs/>
+        </w:rPr>
+      </w:pPr>
+      <w:proofErr w:type="spellStart"/>
+      <w:r>
+        <w:rPr>
+          <w:rFonts w:ascii="Cambria" w:eastAsia="Cambria" w:hAnsi="Cambria" w:cs="Cambria"/>
+        </w:rPr>
+        <w:t>Movassaghi</w:t>
+      </w:r>
+      <w:proofErr w:type="spellEnd"/>
+      <w:r>
+        <w:rPr>
+          <w:rFonts w:ascii="Cambria" w:eastAsia="Cambria" w:hAnsi="Cambria" w:cs="Cambria"/>
+        </w:rPr>
+        <w:t xml:space="preserve"> A., Karve Z., </w:t>
+      </w:r>
+      <w:proofErr w:type="spellStart"/>
+      <w:r>
+        <w:rPr>
+          <w:rFonts w:ascii="Cambria" w:eastAsia="Cambria" w:hAnsi="Cambria" w:cs="Cambria"/>
+        </w:rPr>
+        <w:t>Calpey</w:t>
+      </w:r>
+      <w:proofErr w:type="spellEnd"/>
+      <w:r>
+        <w:rPr>
+          <w:rFonts w:ascii="Cambria" w:eastAsia="Cambria" w:hAnsi="Cambria" w:cs="Cambria"/>
+        </w:rPr>
+        <w:t xml:space="preserve"> J., </w:t>
+      </w:r>
+      <w:r>
+        <w:rPr>
+          <w:rFonts w:ascii="Cambria" w:eastAsia="Cambria" w:hAnsi="Cambria" w:cs="Cambria"/>
+          <w:u w:val="single"/>
+        </w:rPr>
+        <w:t>Reaves J.</w:t>
+      </w:r>
+      <w:r>
+        <w:rPr>
+          <w:rFonts w:ascii="Cambria" w:eastAsia="Cambria" w:hAnsi="Cambria" w:cs="Cambria"/>
+        </w:rPr>
+        <w:t>, Childers J.T., Lack B.T., Lubert</w:t>
+      </w:r>
+      <w:r>
+        <w:rPr>
+          <w:rFonts w:ascii="Cambria" w:eastAsia="Cambria" w:hAnsi="Cambria" w:cs="Cambria"/>
+        </w:rPr>
+        <w:t xml:space="preserve"> </w:t>
+      </w:r>
+      <w:r>
+        <w:rPr>
+          <w:rFonts w:ascii="Cambria" w:eastAsia="Cambria" w:hAnsi="Cambria" w:cs="Cambria"/>
+        </w:rPr>
+        <w:t>J</w:t>
+      </w:r>
+      <w:r>
+        <w:rPr>
+          <w:rFonts w:ascii="Cambria" w:eastAsia="Cambria" w:hAnsi="Cambria" w:cs="Cambria"/>
+        </w:rPr>
+        <w:t>.</w:t>
+      </w:r>
+      <w:r>
+        <w:rPr>
+          <w:rFonts w:ascii="Cambria" w:eastAsia="Cambria" w:hAnsi="Cambria" w:cs="Cambria"/>
+        </w:rPr>
+        <w:t xml:space="preserve">, Sabesan V.J. “Cost-Effectiveness of Surgical Treatment Options for Massive Rotator Cuff Tears.” </w:t>
       </w:r>
       <w:r>
         <w:rPr>
@@ -1127,6 +1218,20 @@
           <w:i/>
           <w:iCs/>
         </w:rPr>
+        <w:t>Poster presentation, Shoulder360 Annual Meeting.</w:t>
+      </w:r>
+      <w:r>
+        <w:rPr>
+          <w:rFonts w:ascii="Cambria" w:eastAsia="Cambria" w:hAnsi="Cambria" w:cs="Cambria"/>
+        </w:rPr>
+        <w:t xml:space="preserve"> Apr. 2026. </w:t>
+      </w:r>
+      <w:r>
+        <w:rPr>
+          <w:rFonts w:ascii="Cambria" w:eastAsia="Cambria" w:hAnsi="Cambria" w:cs="Cambria"/>
+          <w:i/>
+          <w:iCs/>
+        </w:rPr>
         <w:t>[Top 10 Poster Award.]</w:t>
       </w:r>
     </w:p>
@@ -1191,7 +1296,7 @@
         </w:rPr>
         <w:t xml:space="preserve">, 2022. Accessible </w:t>
       </w:r>
-      <w:hyperlink r:id="rId17">
+      <w:hyperlink r:id="rId18">
         <w:r>
           <w:rPr>
             <w:rFonts w:ascii="Cambria" w:eastAsia="Cambria" w:hAnsi="Cambria" w:cs="Cambria"/>
@@ -1265,7 +1370,7 @@
         </w:rPr>
         <w:t xml:space="preserve">, Sept. 2020. Accessible </w:t>
       </w:r>
-      <w:hyperlink r:id="rId18">
+      <w:hyperlink r:id="rId19">
         <w:r>
           <w:rPr>
             <w:rFonts w:ascii="Cambria" w:eastAsia="Cambria" w:hAnsi="Cambria" w:cs="Cambria"/>
@@ -1470,6 +1575,37 @@
         <w:rPr>
           <w:rFonts w:ascii="Cambria" w:eastAsia="Cambria" w:hAnsi="Cambria" w:cs="Cambria"/>
         </w:rPr>
+        <w:t>Interdisciplinary Inquiry and Teaching (IIT)</w:t>
+      </w:r>
+      <w:r>
+        <w:rPr>
+          <w:rFonts w:ascii="Cambria" w:eastAsia="Cambria" w:hAnsi="Cambria" w:cs="Cambria"/>
+        </w:rPr>
+        <w:t xml:space="preserve"> Fellowship</w:t>
+      </w:r>
+      <w:r>
+        <w:rPr>
+          <w:rFonts w:ascii="Cambria" w:eastAsia="Cambria" w:hAnsi="Cambria" w:cs="Cambria"/>
+        </w:rPr>
+        <w:tab/>
+        <w:t>FA24-SP25</w:t>
+      </w:r>
+    </w:p>
+    <w:p>
+      <w:pPr>
+        <w:tabs>
+          <w:tab w:val="right" w:pos="9360"/>
+        </w:tabs>
+        <w:spacing w:after="0" w:line="240" w:lineRule="auto"/>
+        <w:ind w:left="270"/>
+        <w:rPr>
+          <w:rFonts w:ascii="Cambria" w:eastAsia="Cambria" w:hAnsi="Cambria" w:cs="Cambria"/>
+        </w:rPr>
+      </w:pPr>
+      <w:r>
+        <w:rPr>
+          <w:rFonts w:ascii="Cambria" w:eastAsia="Cambria" w:hAnsi="Cambria" w:cs="Cambria"/>
+        </w:rPr>
         <w:t xml:space="preserve">Instructor, PPL 802 — Quantitative Methods in Public Policy II </w:t>
       </w:r>
       <w:r>
@@ -1522,8 +1658,33 @@
           <w:rFonts w:ascii="Cambria" w:eastAsia="Cambria" w:hAnsi="Cambria" w:cs="Cambria"/>
           <w:lang w:val="es-AR"/>
         </w:rPr>
-        <w:t>TA, EC 450 — Environmental Economics</w:t>
-      </w:r>
+        <w:t xml:space="preserve">TA, EC 450 — </w:t>
+      </w:r>
+      <w:proofErr w:type="spellStart"/>
+      <w:r>
+        <w:rPr>
+          <w:rFonts w:ascii="Cambria" w:eastAsia="Cambria" w:hAnsi="Cambria" w:cs="Cambria"/>
+          <w:lang w:val="es-AR"/>
+        </w:rPr>
+        <w:t>Environmental</w:t>
+      </w:r>
+      <w:proofErr w:type="spellEnd"/>
+      <w:r>
+        <w:rPr>
+          <w:rFonts w:ascii="Cambria" w:eastAsia="Cambria" w:hAnsi="Cambria" w:cs="Cambria"/>
+          <w:lang w:val="es-AR"/>
+        </w:rPr>
+        <w:t xml:space="preserve"> </w:t>
+      </w:r>
+      <w:proofErr w:type="spellStart"/>
+      <w:r>
+        <w:rPr>
+          <w:rFonts w:ascii="Cambria" w:eastAsia="Cambria" w:hAnsi="Cambria" w:cs="Cambria"/>
+          <w:lang w:val="es-AR"/>
+        </w:rPr>
+        <w:t>Economics</w:t>
+      </w:r>
+      <w:proofErr w:type="spellEnd"/>
       <w:r>
         <w:rPr>
           <w:rFonts w:ascii="Cambria" w:eastAsia="Cambria" w:hAnsi="Cambria" w:cs="Cambria"/>
@@ -1557,8 +1718,17 @@
           <w:rFonts w:ascii="Cambria" w:eastAsia="Cambria" w:hAnsi="Cambria" w:cs="Cambria"/>
           <w:lang w:val="es-AR"/>
         </w:rPr>
-        <w:t>TA, EC 499 — Senior Seminar</w:t>
-      </w:r>
+        <w:t xml:space="preserve">TA, EC 499 — Senior </w:t>
+      </w:r>
+      <w:proofErr w:type="spellStart"/>
+      <w:r>
+        <w:rPr>
+          <w:rFonts w:ascii="Cambria" w:eastAsia="Cambria" w:hAnsi="Cambria" w:cs="Cambria"/>
+          <w:lang w:val="es-AR"/>
+        </w:rPr>
+        <w:t>Seminar</w:t>
+      </w:r>
+      <w:proofErr w:type="spellEnd"/>
       <w:r>
         <w:rPr>
           <w:rFonts w:ascii="Cambria" w:eastAsia="Cambria" w:hAnsi="Cambria" w:cs="Cambria"/>
@@ -1590,20 +1760,14 @@
         <w:rPr>
           <w:rFonts w:ascii="Cambria" w:eastAsia="Cambria" w:hAnsi="Cambria" w:cs="Cambria"/>
         </w:rPr>
-        <w:t>Interdisciplinary Inquiry and Teaching (IIT)</w:t>
-      </w:r>
-      <w:r>
-        <w:rPr>
-          <w:rFonts w:ascii="Cambria" w:eastAsia="Cambria" w:hAnsi="Cambria" w:cs="Cambria"/>
-        </w:rPr>
-        <w:t xml:space="preserve"> Fellowship | MSU</w:t>
+        <w:t xml:space="preserve">TA, EC 301 — Intermediate Microeconomics </w:t>
       </w:r>
       <w:r>
         <w:rPr>
           <w:rFonts w:ascii="Cambria" w:eastAsia="Cambria" w:hAnsi="Cambria" w:cs="Cambria"/>
         </w:rPr>
         <w:tab/>
-        <w:t>FA24-SP25</w:t>
+        <w:t>SP22, FA26</w:t>
       </w:r>
     </w:p>
     <w:p>
@@ -1646,37 +1810,6 @@
         <w:rPr>
           <w:rFonts w:ascii="Cambria" w:eastAsia="Cambria" w:hAnsi="Cambria" w:cs="Cambria"/>
         </w:rPr>
-        <w:t xml:space="preserve">TA, EC 301 — Intermediate Microeconomics </w:t>
-      </w:r>
-      <w:r>
-        <w:rPr>
-          <w:rFonts w:ascii="Cambria" w:eastAsia="Cambria" w:hAnsi="Cambria" w:cs="Cambria"/>
-        </w:rPr>
-        <w:tab/>
-        <w:t>SP22</w:t>
-      </w:r>
-      <w:r>
-        <w:rPr>
-          <w:rFonts w:ascii="Cambria" w:eastAsia="Cambria" w:hAnsi="Cambria" w:cs="Cambria"/>
-        </w:rPr>
-        <w:t>, FA26</w:t>
-      </w:r>
-    </w:p>
-    <w:p>
-      <w:pPr>
-        <w:tabs>
-          <w:tab w:val="right" w:pos="9360"/>
-        </w:tabs>
-        <w:spacing w:after="0" w:line="240" w:lineRule="auto"/>
-        <w:ind w:left="270"/>
-        <w:rPr>
-          <w:rFonts w:ascii="Cambria" w:eastAsia="Cambria" w:hAnsi="Cambria" w:cs="Cambria"/>
-        </w:rPr>
-      </w:pPr>
-      <w:r>
-        <w:rPr>
-          <w:rFonts w:ascii="Cambria" w:eastAsia="Cambria" w:hAnsi="Cambria" w:cs="Cambria"/>
-        </w:rPr>
         <w:t xml:space="preserve">TA, EC 302 — Intermediate Macroeconomics </w:t>
       </w:r>
       <w:r>
@@ -1739,6 +1872,12 @@
         </w:rPr>
         <w:t>2026: Midwest Economics Association, MSU Grand River Conference</w:t>
       </w:r>
+      <w:r>
+        <w:rPr>
+          <w:rFonts w:ascii="Cambria" w:eastAsia="Cambria" w:hAnsi="Cambria" w:cs="Cambria"/>
+        </w:rPr>
+        <w:t>, Southern Economics Association (forthcoming)</w:t>
+      </w:r>
     </w:p>
     <w:p>
       <w:pPr>
@@ -1919,29 +2058,34 @@
         <w:ind w:left="270"/>
         <w:rPr>
           <w:rFonts w:ascii="Cambria" w:eastAsia="Cambria" w:hAnsi="Cambria" w:cs="Cambria"/>
-        </w:rPr>
-      </w:pPr>
-      <w:r>
-        <w:rPr>
-          <w:rFonts w:ascii="Cambria" w:eastAsia="Cambria" w:hAnsi="Cambria" w:cs="Cambria"/>
+          <w:lang w:val="en-US"/>
+        </w:rPr>
+      </w:pPr>
+      <w:r>
+        <w:rPr>
+          <w:rFonts w:ascii="Cambria" w:eastAsia="Cambria" w:hAnsi="Cambria" w:cs="Cambria"/>
+          <w:lang w:val="en-US"/>
         </w:rPr>
         <w:t>RA, Jamie Wu &amp; Steven Miller (</w:t>
       </w:r>
       <w:r>
         <w:rPr>
           <w:rFonts w:ascii="Cambria" w:eastAsia="Cambria" w:hAnsi="Cambria" w:cs="Cambria"/>
+          <w:lang w:val="en-US"/>
         </w:rPr>
         <w:t>EREC</w:t>
       </w:r>
       <w:r>
         <w:rPr>
           <w:rFonts w:ascii="Cambria" w:eastAsia="Cambria" w:hAnsi="Cambria" w:cs="Cambria"/>
+          <w:lang w:val="en-US"/>
         </w:rPr>
         <w:t>) | MSU</w:t>
       </w:r>
       <w:r>
         <w:rPr>
           <w:rFonts w:ascii="Cambria" w:eastAsia="Cambria" w:hAnsi="Cambria" w:cs="Cambria"/>
+          <w:lang w:val="en-US"/>
         </w:rPr>
         <w:tab/>
         <w:t>2023-2024</w:t>
@@ -2007,36 +2151,42 @@
           <w:rFonts w:ascii="Cambria" w:eastAsia="Cambria" w:hAnsi="Cambria" w:cs="Cambria"/>
           <w:b/>
           <w:bCs/>
-        </w:rPr>
-      </w:pPr>
-      <w:r>
-        <w:rPr>
-          <w:rFonts w:ascii="Cambria" w:eastAsia="Cambria" w:hAnsi="Cambria" w:cs="Cambria"/>
-          <w:b/>
-          <w:bCs/>
-        </w:rPr>
-        <w:br/>
-      </w:r>
-    </w:p>
-    <w:p>
-      <w:pPr>
-        <w:tabs>
-          <w:tab w:val="right" w:pos="9360"/>
-        </w:tabs>
-        <w:spacing w:after="0" w:line="240" w:lineRule="auto"/>
-        <w:rPr>
-          <w:rFonts w:ascii="Cambria" w:eastAsia="Cambria" w:hAnsi="Cambria" w:cs="Cambria"/>
-          <w:b/>
-          <w:bCs/>
-        </w:rPr>
-      </w:pPr>
-      <w:r>
-        <w:rPr>
-          <w:rFonts w:ascii="Cambria" w:eastAsia="Cambria" w:hAnsi="Cambria" w:cs="Cambria"/>
-          <w:b/>
-          <w:bCs/>
-        </w:rPr>
-        <w:lastRenderedPageBreak/>
+          <w:sz w:val="18"/>
+          <w:szCs w:val="18"/>
+        </w:rPr>
+      </w:pPr>
+    </w:p>
+    <w:p>
+      <w:pPr>
+        <w:tabs>
+          <w:tab w:val="right" w:pos="9360"/>
+        </w:tabs>
+        <w:spacing w:after="0" w:line="240" w:lineRule="auto"/>
+        <w:rPr>
+          <w:rFonts w:ascii="Cambria" w:eastAsia="Cambria" w:hAnsi="Cambria" w:cs="Cambria"/>
+          <w:b/>
+          <w:bCs/>
+        </w:rPr>
+      </w:pPr>
+    </w:p>
+    <w:p>
+      <w:pPr>
+        <w:tabs>
+          <w:tab w:val="right" w:pos="9360"/>
+        </w:tabs>
+        <w:spacing w:after="0" w:line="240" w:lineRule="auto"/>
+        <w:rPr>
+          <w:rFonts w:ascii="Cambria" w:eastAsia="Cambria" w:hAnsi="Cambria" w:cs="Cambria"/>
+          <w:b/>
+          <w:bCs/>
+        </w:rPr>
+      </w:pPr>
+      <w:r>
+        <w:rPr>
+          <w:rFonts w:ascii="Cambria" w:eastAsia="Cambria" w:hAnsi="Cambria" w:cs="Cambria"/>
+          <w:b/>
+          <w:bCs/>
+        </w:rPr>
         <w:t>Service</w:t>
       </w:r>
     </w:p>
@@ -2319,7 +2469,21 @@
         <w:rPr>
           <w:rFonts w:ascii="Cambria" w:eastAsia="Cambria" w:hAnsi="Cambria" w:cs="Cambria"/>
         </w:rPr>
-        <w:t xml:space="preserve">      R/RStudio, LaTeX, Git/Github, Tableau, Python, Stata </w:t>
+        <w:t xml:space="preserve">      R/RStudio, LaTeX, Git/</w:t>
+      </w:r>
+      <w:proofErr w:type="spellStart"/>
+      <w:r>
+        <w:rPr>
+          <w:rFonts w:ascii="Cambria" w:eastAsia="Cambria" w:hAnsi="Cambria" w:cs="Cambria"/>
+        </w:rPr>
+        <w:t>Github</w:t>
+      </w:r>
+      <w:proofErr w:type="spellEnd"/>
+      <w:r>
+        <w:rPr>
+          <w:rFonts w:ascii="Cambria" w:eastAsia="Cambria" w:hAnsi="Cambria" w:cs="Cambria"/>
+        </w:rPr>
+        <w:t xml:space="preserve">, Tableau, Python, Stata </w:t>
       </w:r>
     </w:p>
     <w:p>
@@ -2514,7 +2678,7 @@
                 <w:rFonts w:ascii="Cambria" w:eastAsia="Cambria" w:hAnsi="Cambria" w:cs="Cambria"/>
               </w:rPr>
             </w:pPr>
-            <w:hyperlink r:id="rId19" w:history="1">
+            <w:hyperlink r:id="rId20" w:history="1">
               <w:r>
                 <w:rPr>
                   <w:rStyle w:val="Hyperlink"/>
@@ -2612,7 +2776,7 @@
                 <w:rFonts w:ascii="Cambria" w:eastAsia="Cambria" w:hAnsi="Cambria" w:cs="Cambria"/>
               </w:rPr>
             </w:pPr>
-            <w:hyperlink r:id="rId20" w:history="1">
+            <w:hyperlink r:id="rId21" w:history="1">
               <w:r>
                 <w:rPr>
                   <w:rStyle w:val="Hyperlink"/>
@@ -2711,7 +2875,7 @@
                 <w:color w:val="FF0000"/>
               </w:rPr>
             </w:pPr>
-            <w:hyperlink r:id="rId21" w:history="1">
+            <w:hyperlink r:id="rId22" w:history="1">
               <w:r>
                 <w:rPr>
                   <w:rStyle w:val="Hyperlink"/>

</xml_diff>

<commit_message>
Adding both instances of the CSTAT seminar.
</commit_message>
<xml_diff>
--- a/res/JReaves_CV.docx
+++ b/res/JReaves_CV.docx
@@ -245,19 +245,11 @@
               </w:rPr>
               <w:br/>
             </w:r>
-            <w:proofErr w:type="spellStart"/>
             <w:r>
               <w:rPr>
                 <w:rFonts w:ascii="Cambria" w:eastAsia="Cambria" w:hAnsi="Cambria" w:cs="Cambria"/>
               </w:rPr>
-              <w:t>ORCiD</w:t>
-            </w:r>
-            <w:proofErr w:type="spellEnd"/>
-            <w:r>
-              <w:rPr>
-                <w:rFonts w:ascii="Cambria" w:eastAsia="Cambria" w:hAnsi="Cambria" w:cs="Cambria"/>
-              </w:rPr>
-              <w:t xml:space="preserve"> ID: </w:t>
+              <w:t xml:space="preserve">ORCiD ID: </w:t>
             </w:r>
             <w:hyperlink r:id="rId7">
               <w:r>
@@ -863,35 +855,7 @@
         <w:rPr>
           <w:rFonts w:ascii="Cambria" w:eastAsia="Cambria" w:hAnsi="Cambria" w:cs="Cambria"/>
         </w:rPr>
-        <w:t xml:space="preserve">, Hope O. </w:t>
-      </w:r>
-      <w:proofErr w:type="spellStart"/>
-      <w:r>
-        <w:rPr>
-          <w:rFonts w:ascii="Cambria" w:eastAsia="Cambria" w:hAnsi="Cambria" w:cs="Cambria"/>
-        </w:rPr>
-        <w:t>Akaeze</w:t>
-      </w:r>
-      <w:proofErr w:type="spellEnd"/>
-      <w:r>
-        <w:rPr>
-          <w:rFonts w:ascii="Cambria" w:eastAsia="Cambria" w:hAnsi="Cambria" w:cs="Cambria"/>
-        </w:rPr>
-        <w:t xml:space="preserve">, Holli A. Schlukebir, Steven R. Miller, Henry O. </w:t>
-      </w:r>
-      <w:proofErr w:type="spellStart"/>
-      <w:r>
-        <w:rPr>
-          <w:rFonts w:ascii="Cambria" w:eastAsia="Cambria" w:hAnsi="Cambria" w:cs="Cambria"/>
-        </w:rPr>
-        <w:t>Akaeze</w:t>
-      </w:r>
-      <w:proofErr w:type="spellEnd"/>
-      <w:r>
-        <w:rPr>
-          <w:rFonts w:ascii="Cambria" w:eastAsia="Cambria" w:hAnsi="Cambria" w:cs="Cambria"/>
-        </w:rPr>
-        <w:t xml:space="preserve">, and Jamie Heng-Chieh Wu. “More Care, More Workers? Gauging the Impact of Child Care Access on Labor Force Participation.” </w:t>
+        <w:t xml:space="preserve">, Hope O. Akaeze, Holli A. Schlukebir, Steven R. Miller, Henry O. Akaeze, and Jamie Heng-Chieh Wu. “More Care, More Workers? Gauging the Impact of Child Care Access on Labor Force Participation.” </w:t>
       </w:r>
       <w:r>
         <w:rPr>
@@ -979,35 +943,7 @@
         <w:rPr>
           <w:rFonts w:ascii="Cambria" w:eastAsia="Cambria" w:hAnsi="Cambria" w:cs="Cambria"/>
         </w:rPr>
-        <w:t xml:space="preserve">, &amp; Mark Brennen </w:t>
-      </w:r>
-      <w:proofErr w:type="spellStart"/>
-      <w:r>
-        <w:rPr>
-          <w:rFonts w:ascii="Cambria" w:eastAsia="Cambria" w:hAnsi="Cambria" w:cs="Cambria"/>
-        </w:rPr>
-        <w:t>VanderVeen</w:t>
-      </w:r>
-      <w:proofErr w:type="spellEnd"/>
-      <w:r>
-        <w:rPr>
-          <w:rFonts w:ascii="Cambria" w:eastAsia="Cambria" w:hAnsi="Cambria" w:cs="Cambria"/>
-        </w:rPr>
-        <w:t xml:space="preserve">. “Applying Transreading in Teaching </w:t>
-      </w:r>
-      <w:proofErr w:type="spellStart"/>
-      <w:r>
-        <w:rPr>
-          <w:rFonts w:ascii="Cambria" w:eastAsia="Cambria" w:hAnsi="Cambria" w:cs="Cambria"/>
-        </w:rPr>
-        <w:t>Literaturphilosophie</w:t>
-      </w:r>
-      <w:proofErr w:type="spellEnd"/>
-      <w:r>
-        <w:rPr>
-          <w:rFonts w:ascii="Cambria" w:eastAsia="Cambria" w:hAnsi="Cambria" w:cs="Cambria"/>
-        </w:rPr>
-        <w:t xml:space="preserve">: Laozi, Kierkegaard, Nietzsche, and Olav H. Hauge.” Chapter in </w:t>
+        <w:t xml:space="preserve">, &amp; Mark Brennen VanderVeen. “Applying Transreading in Teaching Literaturphilosophie: Laozi, Kierkegaard, Nietzsche, and Olav H. Hauge.” Chapter in </w:t>
       </w:r>
       <w:r>
         <w:rPr>
@@ -1147,33 +1083,11 @@
           <w:bCs/>
         </w:rPr>
       </w:pPr>
-      <w:proofErr w:type="spellStart"/>
-      <w:r>
-        <w:rPr>
-          <w:rFonts w:ascii="Cambria" w:eastAsia="Cambria" w:hAnsi="Cambria" w:cs="Cambria"/>
-        </w:rPr>
-        <w:t>Movassaghi</w:t>
-      </w:r>
-      <w:proofErr w:type="spellEnd"/>
-      <w:r>
-        <w:rPr>
-          <w:rFonts w:ascii="Cambria" w:eastAsia="Cambria" w:hAnsi="Cambria" w:cs="Cambria"/>
-        </w:rPr>
-        <w:t xml:space="preserve"> A., Karve Z., </w:t>
-      </w:r>
-      <w:proofErr w:type="spellStart"/>
-      <w:r>
-        <w:rPr>
-          <w:rFonts w:ascii="Cambria" w:eastAsia="Cambria" w:hAnsi="Cambria" w:cs="Cambria"/>
-        </w:rPr>
-        <w:t>Calpey</w:t>
-      </w:r>
-      <w:proofErr w:type="spellEnd"/>
-      <w:r>
-        <w:rPr>
-          <w:rFonts w:ascii="Cambria" w:eastAsia="Cambria" w:hAnsi="Cambria" w:cs="Cambria"/>
-        </w:rPr>
-        <w:t xml:space="preserve"> J., </w:t>
+      <w:r>
+        <w:rPr>
+          <w:rFonts w:ascii="Cambria" w:eastAsia="Cambria" w:hAnsi="Cambria" w:cs="Cambria"/>
+        </w:rPr>
+        <w:t xml:space="preserve">Movassaghi A., Karve Z., Calpey J., </w:t>
       </w:r>
       <w:r>
         <w:rPr>
@@ -1658,33 +1572,8 @@
           <w:rFonts w:ascii="Cambria" w:eastAsia="Cambria" w:hAnsi="Cambria" w:cs="Cambria"/>
           <w:lang w:val="es-AR"/>
         </w:rPr>
-        <w:t xml:space="preserve">TA, EC 450 — </w:t>
-      </w:r>
-      <w:proofErr w:type="spellStart"/>
-      <w:r>
-        <w:rPr>
-          <w:rFonts w:ascii="Cambria" w:eastAsia="Cambria" w:hAnsi="Cambria" w:cs="Cambria"/>
-          <w:lang w:val="es-AR"/>
-        </w:rPr>
-        <w:t>Environmental</w:t>
-      </w:r>
-      <w:proofErr w:type="spellEnd"/>
-      <w:r>
-        <w:rPr>
-          <w:rFonts w:ascii="Cambria" w:eastAsia="Cambria" w:hAnsi="Cambria" w:cs="Cambria"/>
-          <w:lang w:val="es-AR"/>
-        </w:rPr>
-        <w:t xml:space="preserve"> </w:t>
-      </w:r>
-      <w:proofErr w:type="spellStart"/>
-      <w:r>
-        <w:rPr>
-          <w:rFonts w:ascii="Cambria" w:eastAsia="Cambria" w:hAnsi="Cambria" w:cs="Cambria"/>
-          <w:lang w:val="es-AR"/>
-        </w:rPr>
-        <w:t>Economics</w:t>
-      </w:r>
-      <w:proofErr w:type="spellEnd"/>
+        <w:t>TA, EC 450 — Environmental Economics</w:t>
+      </w:r>
       <w:r>
         <w:rPr>
           <w:rFonts w:ascii="Cambria" w:eastAsia="Cambria" w:hAnsi="Cambria" w:cs="Cambria"/>
@@ -1718,17 +1607,8 @@
           <w:rFonts w:ascii="Cambria" w:eastAsia="Cambria" w:hAnsi="Cambria" w:cs="Cambria"/>
           <w:lang w:val="es-AR"/>
         </w:rPr>
-        <w:t xml:space="preserve">TA, EC 499 — Senior </w:t>
-      </w:r>
-      <w:proofErr w:type="spellStart"/>
-      <w:r>
-        <w:rPr>
-          <w:rFonts w:ascii="Cambria" w:eastAsia="Cambria" w:hAnsi="Cambria" w:cs="Cambria"/>
-          <w:lang w:val="es-AR"/>
-        </w:rPr>
-        <w:t>Seminar</w:t>
-      </w:r>
-      <w:proofErr w:type="spellEnd"/>
+        <w:t>TA, EC 499 — Senior Seminar</w:t>
+      </w:r>
       <w:r>
         <w:rPr>
           <w:rFonts w:ascii="Cambria" w:eastAsia="Cambria" w:hAnsi="Cambria" w:cs="Cambria"/>
@@ -2347,7 +2227,18 @@
           <w:rFonts w:ascii="Cambria" w:eastAsia="Cambria" w:hAnsi="Cambria" w:cs="Cambria"/>
         </w:rPr>
         <w:tab/>
-        <w:t>Fall 2025</w:t>
+      </w:r>
+      <w:r>
+        <w:rPr>
+          <w:rFonts w:ascii="Cambria" w:eastAsia="Cambria" w:hAnsi="Cambria" w:cs="Cambria"/>
+        </w:rPr>
+        <w:t>FA</w:t>
+      </w:r>
+      <w:r>
+        <w:rPr>
+          <w:rFonts w:ascii="Cambria" w:eastAsia="Cambria" w:hAnsi="Cambria" w:cs="Cambria"/>
+        </w:rPr>
+        <w:t>25</w:t>
       </w:r>
     </w:p>
     <w:p>
@@ -2372,7 +2263,13 @@
           <w:rFonts w:ascii="Cambria" w:eastAsia="Cambria" w:hAnsi="Cambria" w:cs="Cambria"/>
         </w:rPr>
         <w:tab/>
-        <w:t>Spring 2025</w:t>
+        <w:t>S</w:t>
+      </w:r>
+      <w:r>
+        <w:rPr>
+          <w:rFonts w:ascii="Cambria" w:eastAsia="Cambria" w:hAnsi="Cambria" w:cs="Cambria"/>
+        </w:rPr>
+        <w:t xml:space="preserve">P25, SU26 </w:t>
       </w:r>
     </w:p>
     <w:p>
@@ -2399,7 +2296,18 @@
           <w:rFonts w:ascii="Cambria" w:eastAsia="Cambria" w:hAnsi="Cambria" w:cs="Cambria"/>
         </w:rPr>
         <w:tab/>
-        <w:t>Fall 2023</w:t>
+      </w:r>
+      <w:r>
+        <w:rPr>
+          <w:rFonts w:ascii="Cambria" w:eastAsia="Cambria" w:hAnsi="Cambria" w:cs="Cambria"/>
+        </w:rPr>
+        <w:t>FA2</w:t>
+      </w:r>
+      <w:r>
+        <w:rPr>
+          <w:rFonts w:ascii="Cambria" w:eastAsia="Cambria" w:hAnsi="Cambria" w:cs="Cambria"/>
+        </w:rPr>
+        <w:t>3</w:t>
       </w:r>
     </w:p>
     <w:p>
@@ -2469,21 +2377,7 @@
         <w:rPr>
           <w:rFonts w:ascii="Cambria" w:eastAsia="Cambria" w:hAnsi="Cambria" w:cs="Cambria"/>
         </w:rPr>
-        <w:t xml:space="preserve">      R/RStudio, LaTeX, Git/</w:t>
-      </w:r>
-      <w:proofErr w:type="spellStart"/>
-      <w:r>
-        <w:rPr>
-          <w:rFonts w:ascii="Cambria" w:eastAsia="Cambria" w:hAnsi="Cambria" w:cs="Cambria"/>
-        </w:rPr>
-        <w:t>Github</w:t>
-      </w:r>
-      <w:proofErr w:type="spellEnd"/>
-      <w:r>
-        <w:rPr>
-          <w:rFonts w:ascii="Cambria" w:eastAsia="Cambria" w:hAnsi="Cambria" w:cs="Cambria"/>
-        </w:rPr>
-        <w:t xml:space="preserve">, Tableau, Python, Stata </w:t>
+        <w:t xml:space="preserve">      R/RStudio, LaTeX, Git/Github, Tableau, Python, Stata </w:t>
       </w:r>
     </w:p>
     <w:p>

</xml_diff>

<commit_message>
cv years of tutoring
</commit_message>
<xml_diff>
--- a/res/JReaves_CV.docx
+++ b/res/JReaves_CV.docx
@@ -2092,7 +2092,25 @@
           <w:rFonts w:ascii="Cambria" w:eastAsia="Cambria" w:hAnsi="Cambria" w:cs="Cambria"/>
         </w:rPr>
         <w:tab/>
-        <w:t>2022-2024</w:t>
+        <w:t>202</w:t>
+      </w:r>
+      <w:r>
+        <w:rPr>
+          <w:rFonts w:ascii="Cambria" w:eastAsia="Cambria" w:hAnsi="Cambria" w:cs="Cambria"/>
+        </w:rPr>
+        <w:t>3</w:t>
+      </w:r>
+      <w:r>
+        <w:rPr>
+          <w:rFonts w:ascii="Cambria" w:eastAsia="Cambria" w:hAnsi="Cambria" w:cs="Cambria"/>
+        </w:rPr>
+        <w:t>-202</w:t>
+      </w:r>
+      <w:r>
+        <w:rPr>
+          <w:rFonts w:ascii="Cambria" w:eastAsia="Cambria" w:hAnsi="Cambria" w:cs="Cambria"/>
+        </w:rPr>
+        <w:t>5</w:t>
       </w:r>
     </w:p>
     <w:p>

</xml_diff>